<commit_message>
Document observed smoke results and link lab sources
</commit_message>
<xml_diff>
--- a/reports/Отчет_о_лабораторной_работе_1_Козионов.docx
+++ b/reports/Отчет_о_лабораторной_работе_1_Козионов.docx
@@ -434,6 +434,34 @@
             <w:rStyle w:val="aff8"/>
           </w:rPr>
           <w:t>https://github.com/nyambus/urfu_java_edu_2sem</w:t>
+        </w:r>
+      </w:hyperlink>
+    </w:p>
+    <w:p>
+      <w:pPr>
+        <w:pStyle w:val="BodyText"/>
+        <w:ind w:firstLine="0"/>
+        <w:jc w:val="both"/>
+      </w:pPr>
+      <w:r>
+        <w:rPr>
+          <w:rFonts w:ascii="Times New Roman" w:hAnsi="Times New Roman"/>
+          <w:sz w:val="28"/>
+        </w:rPr>
+        <w:t>Конфигурация сборки: lab1-spring-mvc/pom.xml</w:t>
+      </w:r>
+    </w:p>
+    <w:p>
+      <w:pPr>
+        <w:pStyle w:val="BodyText"/>
+        <w:jc w:val="center"/>
+      </w:pPr>
+      <w:hyperlink r:id="rId9">
+        <w:r>
+          <w:rPr>
+            <w:rStyle w:val="aff8"/>
+          </w:rPr>
+          <w:t>https://github.com/nyambus/urfu_java_edu_2sem/blob/main/lab1-spring-mvc/pom.xml</w:t>
         </w:r>
       </w:hyperlink>
     </w:p>

</xml_diff>